<commit_message>
Update project charter and add user requirements
Update SDLC/PROJECT CHARTER.docx (modified for visuals only) and add a new SDLC/User Requirements Document.docx.
</commit_message>
<xml_diff>
--- a/SDLC/PROJECT CHARTER.docx
+++ b/SDLC/PROJECT CHARTER.docx
@@ -163,25 +163,7 @@
         <w:rPr>
           <w:lang w:val="en-GB"/>
         </w:rPr>
-        <w:t xml:space="preserve"> </w:t>
-      </w:r>
-      <w:r>
-        <w:rPr>
-          <w:lang w:val="en-GB"/>
-        </w:rPr>
-        <w:t>(internal</w:t>
-      </w:r>
-      <w:r>
-        <w:rPr>
-          <w:lang w:val="en-GB"/>
-        </w:rPr>
-        <w:t xml:space="preserve"> academic</w:t>
-      </w:r>
-      <w:r>
-        <w:rPr>
-          <w:lang w:val="en-GB"/>
-        </w:rPr>
-        <w:t xml:space="preserve"> project)</w:t>
+        <w:t xml:space="preserve"> (internal academic project)</w:t>
       </w:r>
     </w:p>
     <w:p>
@@ -221,19 +203,7 @@
         <w:rPr>
           <w:lang w:val="en-GB"/>
         </w:rPr>
-        <w:t xml:space="preserve">Budget: N/A (internal </w:t>
-      </w:r>
-      <w:r>
-        <w:rPr>
-          <w:lang w:val="en-GB"/>
-        </w:rPr>
-        <w:t xml:space="preserve">academic </w:t>
-      </w:r>
-      <w:r>
-        <w:rPr>
-          <w:lang w:val="en-GB"/>
-        </w:rPr>
-        <w:t>project)</w:t>
+        <w:t>Budget: N/A (internal academic project)</w:t>
       </w:r>
     </w:p>
     <w:p>
@@ -1154,21 +1124,22 @@
       </w:tblPr>
       <w:tblGrid>
         <w:gridCol w:w="4165"/>
-        <w:gridCol w:w="2701"/>
-        <w:gridCol w:w="1768"/>
+        <w:gridCol w:w="2652"/>
+        <w:gridCol w:w="1719"/>
       </w:tblGrid>
       <w:tr>
         <w:tc>
           <w:tcPr>
             <w:tcW w:w="0" w:type="auto"/>
-            <w:shd w:val="clear" w:color="auto" w:fill="D9D9D9" w:themeFill="background1" w:themeFillShade="D9"/>
+            <w:shd w:val="clear" w:color="auto" w:fill="FFFF00"/>
+            <w:vAlign w:val="center"/>
           </w:tcPr>
           <w:p>
             <w:pPr>
               <w:pStyle w:val="ListParagraph"/>
               <w:spacing w:line="276" w:lineRule="auto"/>
               <w:ind w:left="0"/>
-              <w:jc w:val="both"/>
+              <w:jc w:val="center"/>
               <w:rPr>
                 <w:lang w:val="en-GB"/>
               </w:rPr>
@@ -1177,21 +1148,22 @@
               <w:rPr>
                 <w:lang w:val="en-GB"/>
               </w:rPr>
-              <w:t xml:space="preserve"> Milestone                           </w:t>
+              <w:t>Milestone</w:t>
             </w:r>
           </w:p>
         </w:tc>
         <w:tc>
           <w:tcPr>
             <w:tcW w:w="0" w:type="auto"/>
-            <w:shd w:val="clear" w:color="auto" w:fill="D9D9D9" w:themeFill="background1" w:themeFillShade="D9"/>
+            <w:shd w:val="clear" w:color="auto" w:fill="FFFF00"/>
+            <w:vAlign w:val="center"/>
           </w:tcPr>
           <w:p>
             <w:pPr>
               <w:pStyle w:val="ListParagraph"/>
               <w:spacing w:line="276" w:lineRule="auto"/>
               <w:ind w:left="0"/>
-              <w:jc w:val="both"/>
+              <w:jc w:val="center"/>
               <w:rPr>
                 <w:lang w:val="en-GB"/>
               </w:rPr>
@@ -1200,21 +1172,22 @@
               <w:rPr>
                 <w:lang w:val="en-GB"/>
               </w:rPr>
-              <w:t xml:space="preserve"> Target Completion Date </w:t>
+              <w:t>Target Completion Date</w:t>
             </w:r>
           </w:p>
         </w:tc>
         <w:tc>
           <w:tcPr>
             <w:tcW w:w="0" w:type="auto"/>
-            <w:shd w:val="clear" w:color="auto" w:fill="D9D9D9" w:themeFill="background1" w:themeFillShade="D9"/>
+            <w:shd w:val="clear" w:color="auto" w:fill="FFFF00"/>
+            <w:vAlign w:val="center"/>
           </w:tcPr>
           <w:p>
             <w:pPr>
               <w:pStyle w:val="ListParagraph"/>
               <w:spacing w:line="276" w:lineRule="auto"/>
               <w:ind w:left="0"/>
-              <w:jc w:val="both"/>
+              <w:jc w:val="center"/>
               <w:rPr>
                 <w:lang w:val="en-GB"/>
               </w:rPr>
@@ -1223,7 +1196,7 @@
               <w:rPr>
                 <w:lang w:val="en-GB"/>
               </w:rPr>
-              <w:t xml:space="preserve"> Dependencies </w:t>
+              <w:t>Dependencies</w:t>
             </w:r>
           </w:p>
         </w:tc>
@@ -1232,13 +1205,13 @@
         <w:tc>
           <w:tcPr>
             <w:tcW w:w="0" w:type="auto"/>
+            <w:vAlign w:val="center"/>
           </w:tcPr>
           <w:p>
             <w:pPr>
               <w:pStyle w:val="ListParagraph"/>
               <w:spacing w:line="276" w:lineRule="auto"/>
               <w:ind w:left="0"/>
-              <w:jc w:val="both"/>
               <w:rPr>
                 <w:lang w:val="en-GB"/>
               </w:rPr>
@@ -1254,13 +1227,13 @@
         <w:tc>
           <w:tcPr>
             <w:tcW w:w="0" w:type="auto"/>
+            <w:vAlign w:val="center"/>
           </w:tcPr>
           <w:p>
             <w:pPr>
               <w:pStyle w:val="ListParagraph"/>
               <w:spacing w:line="276" w:lineRule="auto"/>
               <w:ind w:left="0"/>
-              <w:jc w:val="both"/>
               <w:rPr>
                 <w:lang w:val="en-GB"/>
               </w:rPr>
@@ -1288,13 +1261,13 @@
         <w:tc>
           <w:tcPr>
             <w:tcW w:w="0" w:type="auto"/>
+            <w:vAlign w:val="center"/>
           </w:tcPr>
           <w:p>
             <w:pPr>
               <w:pStyle w:val="ListParagraph"/>
               <w:spacing w:line="276" w:lineRule="auto"/>
               <w:ind w:left="0"/>
-              <w:jc w:val="both"/>
               <w:rPr>
                 <w:lang w:val="en-GB"/>
               </w:rPr>
@@ -1312,13 +1285,13 @@
         <w:tc>
           <w:tcPr>
             <w:tcW w:w="0" w:type="auto"/>
+            <w:vAlign w:val="center"/>
           </w:tcPr>
           <w:p>
             <w:pPr>
               <w:pStyle w:val="ListParagraph"/>
               <w:spacing w:line="276" w:lineRule="auto"/>
               <w:ind w:left="0"/>
-              <w:jc w:val="both"/>
               <w:rPr>
                 <w:lang w:val="en-GB"/>
               </w:rPr>
@@ -1334,13 +1307,13 @@
         <w:tc>
           <w:tcPr>
             <w:tcW w:w="0" w:type="auto"/>
+            <w:vAlign w:val="center"/>
           </w:tcPr>
           <w:p>
             <w:pPr>
               <w:pStyle w:val="ListParagraph"/>
               <w:spacing w:line="276" w:lineRule="auto"/>
               <w:ind w:left="0"/>
-              <w:jc w:val="both"/>
               <w:rPr>
                 <w:lang w:val="en-GB"/>
               </w:rPr>
@@ -1380,13 +1353,13 @@
         <w:tc>
           <w:tcPr>
             <w:tcW w:w="0" w:type="auto"/>
+            <w:vAlign w:val="center"/>
           </w:tcPr>
           <w:p>
             <w:pPr>
               <w:pStyle w:val="ListParagraph"/>
               <w:spacing w:line="276" w:lineRule="auto"/>
               <w:ind w:left="0"/>
-              <w:jc w:val="both"/>
               <w:rPr>
                 <w:lang w:val="en-GB"/>
               </w:rPr>
@@ -1404,13 +1377,13 @@
         <w:tc>
           <w:tcPr>
             <w:tcW w:w="0" w:type="auto"/>
+            <w:vAlign w:val="center"/>
           </w:tcPr>
           <w:p>
             <w:pPr>
               <w:pStyle w:val="ListParagraph"/>
               <w:spacing w:line="276" w:lineRule="auto"/>
               <w:ind w:left="0"/>
-              <w:jc w:val="both"/>
               <w:rPr>
                 <w:lang w:val="en-GB"/>
               </w:rPr>
@@ -1426,13 +1399,13 @@
         <w:tc>
           <w:tcPr>
             <w:tcW w:w="0" w:type="auto"/>
+            <w:vAlign w:val="center"/>
           </w:tcPr>
           <w:p>
             <w:pPr>
               <w:pStyle w:val="ListParagraph"/>
               <w:spacing w:line="276" w:lineRule="auto"/>
               <w:ind w:left="0"/>
-              <w:jc w:val="both"/>
               <w:rPr>
                 <w:lang w:val="en-GB"/>
               </w:rPr>
@@ -1472,13 +1445,13 @@
         <w:tc>
           <w:tcPr>
             <w:tcW w:w="0" w:type="auto"/>
+            <w:vAlign w:val="center"/>
           </w:tcPr>
           <w:p>
             <w:pPr>
               <w:pStyle w:val="ListParagraph"/>
               <w:spacing w:line="276" w:lineRule="auto"/>
               <w:ind w:left="0"/>
-              <w:jc w:val="both"/>
               <w:rPr>
                 <w:lang w:val="en-GB"/>
               </w:rPr>
@@ -1496,13 +1469,13 @@
         <w:tc>
           <w:tcPr>
             <w:tcW w:w="0" w:type="auto"/>
+            <w:vAlign w:val="center"/>
           </w:tcPr>
           <w:p>
             <w:pPr>
               <w:pStyle w:val="ListParagraph"/>
               <w:spacing w:line="276" w:lineRule="auto"/>
               <w:ind w:left="0"/>
-              <w:jc w:val="both"/>
               <w:rPr>
                 <w:lang w:val="en-GB"/>
               </w:rPr>
@@ -1518,13 +1491,13 @@
         <w:tc>
           <w:tcPr>
             <w:tcW w:w="0" w:type="auto"/>
+            <w:vAlign w:val="center"/>
           </w:tcPr>
           <w:p>
             <w:pPr>
               <w:pStyle w:val="ListParagraph"/>
               <w:spacing w:line="276" w:lineRule="auto"/>
               <w:ind w:left="0"/>
-              <w:jc w:val="both"/>
               <w:rPr>
                 <w:lang w:val="en-GB"/>
               </w:rPr>
@@ -1564,13 +1537,13 @@
         <w:tc>
           <w:tcPr>
             <w:tcW w:w="0" w:type="auto"/>
+            <w:vAlign w:val="center"/>
           </w:tcPr>
           <w:p>
             <w:pPr>
               <w:pStyle w:val="ListParagraph"/>
               <w:spacing w:line="276" w:lineRule="auto"/>
               <w:ind w:left="0"/>
-              <w:jc w:val="both"/>
               <w:rPr>
                 <w:lang w:val="en-GB"/>
               </w:rPr>
@@ -1588,13 +1561,13 @@
         <w:tc>
           <w:tcPr>
             <w:tcW w:w="0" w:type="auto"/>
+            <w:vAlign w:val="center"/>
           </w:tcPr>
           <w:p>
             <w:pPr>
               <w:pStyle w:val="ListParagraph"/>
               <w:spacing w:line="276" w:lineRule="auto"/>
               <w:ind w:left="0"/>
-              <w:jc w:val="both"/>
               <w:rPr>
                 <w:lang w:val="en-GB"/>
               </w:rPr>
@@ -1610,13 +1583,13 @@
         <w:tc>
           <w:tcPr>
             <w:tcW w:w="0" w:type="auto"/>
+            <w:vAlign w:val="center"/>
           </w:tcPr>
           <w:p>
             <w:pPr>
               <w:pStyle w:val="ListParagraph"/>
               <w:spacing w:line="276" w:lineRule="auto"/>
               <w:ind w:left="0"/>
-              <w:jc w:val="both"/>
               <w:rPr>
                 <w:lang w:val="en-GB"/>
               </w:rPr>
@@ -1644,13 +1617,13 @@
         <w:tc>
           <w:tcPr>
             <w:tcW w:w="0" w:type="auto"/>
+            <w:vAlign w:val="center"/>
           </w:tcPr>
           <w:p>
             <w:pPr>
               <w:pStyle w:val="ListParagraph"/>
               <w:spacing w:line="276" w:lineRule="auto"/>
               <w:ind w:left="0"/>
-              <w:jc w:val="both"/>
               <w:rPr>
                 <w:lang w:val="en-GB"/>
               </w:rPr>
@@ -1725,14 +1698,15 @@
         <w:tc>
           <w:tcPr>
             <w:tcW w:w="0" w:type="auto"/>
-            <w:shd w:val="clear" w:color="auto" w:fill="D9D9D9" w:themeFill="background1" w:themeFillShade="D9"/>
+            <w:shd w:val="clear" w:color="auto" w:fill="FFFF00"/>
+            <w:vAlign w:val="center"/>
           </w:tcPr>
           <w:p>
             <w:pPr>
               <w:pStyle w:val="ListParagraph"/>
               <w:spacing w:line="276" w:lineRule="auto"/>
               <w:ind w:left="0"/>
-              <w:jc w:val="both"/>
+              <w:jc w:val="center"/>
               <w:rPr>
                 <w:lang w:val="en-GB"/>
               </w:rPr>
@@ -1748,14 +1722,15 @@
         <w:tc>
           <w:tcPr>
             <w:tcW w:w="0" w:type="auto"/>
-            <w:shd w:val="clear" w:color="auto" w:fill="D9D9D9" w:themeFill="background1" w:themeFillShade="D9"/>
+            <w:shd w:val="clear" w:color="auto" w:fill="FFFF00"/>
+            <w:vAlign w:val="center"/>
           </w:tcPr>
           <w:p>
             <w:pPr>
               <w:pStyle w:val="ListParagraph"/>
               <w:spacing w:line="276" w:lineRule="auto"/>
               <w:ind w:left="0"/>
-              <w:jc w:val="both"/>
+              <w:jc w:val="center"/>
               <w:rPr>
                 <w:lang w:val="en-GB"/>
               </w:rPr>
@@ -1771,14 +1746,15 @@
         <w:tc>
           <w:tcPr>
             <w:tcW w:w="0" w:type="auto"/>
-            <w:shd w:val="clear" w:color="auto" w:fill="D9D9D9" w:themeFill="background1" w:themeFillShade="D9"/>
+            <w:shd w:val="clear" w:color="auto" w:fill="FFFF00"/>
+            <w:vAlign w:val="center"/>
           </w:tcPr>
           <w:p>
             <w:pPr>
               <w:pStyle w:val="ListParagraph"/>
               <w:spacing w:line="276" w:lineRule="auto"/>
               <w:ind w:left="0"/>
-              <w:jc w:val="both"/>
+              <w:jc w:val="center"/>
               <w:rPr>
                 <w:lang w:val="en-GB"/>
               </w:rPr>
@@ -1796,12 +1772,12 @@
         <w:tc>
           <w:tcPr>
             <w:tcW w:w="0" w:type="auto"/>
+            <w:vAlign w:val="center"/>
             <w:hideMark/>
           </w:tcPr>
           <w:p>
             <w:pPr>
               <w:spacing w:line="276" w:lineRule="auto"/>
-              <w:jc w:val="both"/>
               <w:rPr>
                 <w:rFonts w:eastAsia="Times New Roman" w:cs="Times New Roman"/>
                 <w:kern w:val="0"/>
@@ -1826,7 +1802,6 @@
           <w:p>
             <w:pPr>
               <w:spacing w:line="276" w:lineRule="auto"/>
-              <w:jc w:val="both"/>
               <w:rPr>
                 <w:rFonts w:eastAsia="Times New Roman" w:cs="Times New Roman"/>
                 <w:kern w:val="0"/>
@@ -1851,7 +1826,6 @@
           <w:p>
             <w:pPr>
               <w:spacing w:line="276" w:lineRule="auto"/>
-              <w:jc w:val="both"/>
               <w:rPr>
                 <w:rFonts w:eastAsia="Times New Roman" w:cs="Times New Roman"/>
                 <w:kern w:val="0"/>
@@ -1873,12 +1847,12 @@
         <w:tc>
           <w:tcPr>
             <w:tcW w:w="0" w:type="auto"/>
+            <w:vAlign w:val="center"/>
             <w:hideMark/>
           </w:tcPr>
           <w:p>
             <w:pPr>
               <w:spacing w:line="276" w:lineRule="auto"/>
-              <w:jc w:val="both"/>
               <w:rPr>
                 <w:rFonts w:eastAsia="Times New Roman" w:cs="Times New Roman"/>
                 <w:kern w:val="0"/>
@@ -1903,7 +1877,6 @@
           <w:p>
             <w:pPr>
               <w:spacing w:line="276" w:lineRule="auto"/>
-              <w:jc w:val="both"/>
               <w:rPr>
                 <w:rFonts w:eastAsia="Times New Roman" w:cs="Times New Roman"/>
                 <w:kern w:val="0"/>
@@ -1928,7 +1901,6 @@
           <w:p>
             <w:pPr>
               <w:spacing w:line="276" w:lineRule="auto"/>
-              <w:jc w:val="both"/>
               <w:rPr>
                 <w:rFonts w:eastAsia="Times New Roman" w:cs="Times New Roman"/>
                 <w:kern w:val="0"/>
@@ -1950,12 +1922,12 @@
         <w:tc>
           <w:tcPr>
             <w:tcW w:w="0" w:type="auto"/>
+            <w:vAlign w:val="center"/>
             <w:hideMark/>
           </w:tcPr>
           <w:p>
             <w:pPr>
               <w:spacing w:line="276" w:lineRule="auto"/>
-              <w:jc w:val="both"/>
               <w:rPr>
                 <w:rFonts w:eastAsia="Times New Roman" w:cs="Times New Roman"/>
                 <w:kern w:val="0"/>
@@ -1980,7 +1952,6 @@
           <w:p>
             <w:pPr>
               <w:spacing w:line="276" w:lineRule="auto"/>
-              <w:jc w:val="both"/>
               <w:rPr>
                 <w:rFonts w:eastAsia="Times New Roman" w:cs="Times New Roman"/>
                 <w:kern w:val="0"/>
@@ -2005,7 +1976,6 @@
           <w:p>
             <w:pPr>
               <w:spacing w:line="276" w:lineRule="auto"/>
-              <w:jc w:val="both"/>
               <w:rPr>
                 <w:rFonts w:eastAsia="Times New Roman" w:cs="Times New Roman"/>
                 <w:kern w:val="0"/>
@@ -2027,12 +1997,12 @@
         <w:tc>
           <w:tcPr>
             <w:tcW w:w="0" w:type="auto"/>
+            <w:vAlign w:val="center"/>
             <w:hideMark/>
           </w:tcPr>
           <w:p>
             <w:pPr>
               <w:spacing w:line="276" w:lineRule="auto"/>
-              <w:jc w:val="both"/>
               <w:rPr>
                 <w:rFonts w:eastAsia="Times New Roman" w:cs="Times New Roman"/>
                 <w:kern w:val="0"/>
@@ -2057,7 +2027,6 @@
           <w:p>
             <w:pPr>
               <w:spacing w:line="276" w:lineRule="auto"/>
-              <w:jc w:val="both"/>
               <w:rPr>
                 <w:rFonts w:eastAsia="Times New Roman" w:cs="Times New Roman"/>
                 <w:kern w:val="0"/>
@@ -2082,7 +2051,6 @@
           <w:p>
             <w:pPr>
               <w:spacing w:line="276" w:lineRule="auto"/>
-              <w:jc w:val="both"/>
               <w:rPr>
                 <w:rFonts w:eastAsia="Times New Roman" w:cs="Times New Roman"/>
                 <w:kern w:val="0"/>
@@ -2104,12 +2072,12 @@
         <w:tc>
           <w:tcPr>
             <w:tcW w:w="0" w:type="auto"/>
+            <w:vAlign w:val="center"/>
             <w:hideMark/>
           </w:tcPr>
           <w:p>
             <w:pPr>
               <w:spacing w:line="276" w:lineRule="auto"/>
-              <w:jc w:val="both"/>
               <w:rPr>
                 <w:rFonts w:eastAsia="Times New Roman" w:cs="Times New Roman"/>
                 <w:kern w:val="0"/>
@@ -2134,7 +2102,6 @@
           <w:p>
             <w:pPr>
               <w:spacing w:line="276" w:lineRule="auto"/>
-              <w:jc w:val="both"/>
               <w:rPr>
                 <w:rFonts w:eastAsia="Times New Roman" w:cs="Times New Roman"/>
                 <w:kern w:val="0"/>
@@ -2159,7 +2126,6 @@
           <w:p>
             <w:pPr>
               <w:spacing w:line="276" w:lineRule="auto"/>
-              <w:jc w:val="both"/>
               <w:rPr>
                 <w:rFonts w:eastAsia="Times New Roman" w:cs="Times New Roman"/>
                 <w:kern w:val="0"/>
@@ -4484,8 +4450,10 @@
     <w:rsidRoot w:val="00B41427"/>
     <w:rsid w:val="00881240"/>
     <w:rsid w:val="00921858"/>
+    <w:rsid w:val="00A1333A"/>
     <w:rsid w:val="00B41427"/>
     <w:rsid w:val="00C027C7"/>
+    <w:rsid w:val="00C96C32"/>
     <w:rsid w:val="00E82E63"/>
     <w:rsid w:val="00F70A44"/>
   </w:rsids>

</xml_diff>